<commit_message>
Add mail workflow and update food and movement processing
</commit_message>
<xml_diff>
--- a/Documents/Templates/Extracts [food]/{yyyy}-{mm}-{dd} {OrderNumber} (снять с продовольствия [ЧУЖИЕ] - {Raporter}) {Signatory}.docx
+++ b/Documents/Templates/Extracts [food]/{yyyy}-{mm}-{dd} {OrderNumber} (снять с продовольствия [ЧУЖИЕ] - {Raporter}) {Signatory}.docx
@@ -476,6 +476,46 @@
           <w:szCs w:val="28"/>
         </w:rPr>
       </w:pPr>
+      <w:r>
+        <w:rPr>
+          <w:sz w:val="28"/>
+          <w:szCs w:val="28"/>
+        </w:rPr>
+        <w:t>{</w:t>
+      </w:r>
+      <w:r>
+        <w:rPr>
+          <w:sz w:val="28"/>
+          <w:szCs w:val="28"/>
+          <w:lang w:val="en-US"/>
+        </w:rPr>
+        <w:t>FoodC</w:t>
+      </w:r>
+      <w:r>
+        <w:rPr>
+          <w:sz w:val="28"/>
+          <w:szCs w:val="28"/>
+          <w:lang w:val="en-US"/>
+        </w:rPr>
+        <w:t>ard</w:t>
+      </w:r>
+      <w:r>
+        <w:rPr>
+          <w:sz w:val="28"/>
+          <w:szCs w:val="28"/>
+        </w:rPr>
+        <w:t>}</w:t>
+      </w:r>
+    </w:p>
+    <w:p>
+      <w:pPr>
+        <w:ind w:firstLine="709"/>
+        <w:jc w:val="both"/>
+        <w:rPr>
+          <w:sz w:val="28"/>
+          <w:szCs w:val="28"/>
+        </w:rPr>
+      </w:pPr>
     </w:p>
     <w:p>
       <w:pPr>
@@ -508,7 +548,6 @@
         <w:rPr>
           <w:sz w:val="28"/>
           <w:szCs w:val="28"/>
-          <w:lang w:val="ru-RU"/>
         </w:rPr>
       </w:pPr>
     </w:p>
@@ -519,7 +558,6 @@
         <w:rPr>
           <w:sz w:val="28"/>
           <w:szCs w:val="28"/>
-          <w:lang w:val="ru-RU"/>
         </w:rPr>
       </w:pPr>
     </w:p>

</xml_diff>